<commit_message>
Remove two supplementary table families and renumber
</commit_message>
<xml_diff>
--- a/analysis/output/manuscript/Main-analysis.docx
+++ b/analysis/output/manuscript/Main-analysis.docx
@@ -70,7 +70,7 @@
         <w:keepLines/>
       </w:pPr>
       <w:r>
-        <w:t xml:space="preserve">Figure 5 distinguishes five-level from collapsed signalling-answer agreement on paired eligible components. In D3 against Human Review 1, the five-level difference is −10.3 points (95% CI, −17.2 to −3.2), whereas the collapsed difference is +8.5 (3.5–13.7), both on 165 components. D5 collapsed gains are +11.3 points for Human Review 1 and +3.7 (−0.3 to 7.4) for Human Review 2. eTable 6 retains source-specific domain summaries, eligibility accounting and complete paired question contrasts for both codings, including sparse and unfavorable results.</w:t>
+        <w:t xml:space="preserve">Figure 5 distinguishes five-level from collapsed signalling-answer agreement on paired eligible components. In D3 against Human Review 1, the five-level difference is −10.3 points (95% CI, −17.2 to −3.2), whereas the collapsed difference is +8.5 (3.5–13.7), both on 165 components. D5 collapsed gains are +11.3 points for Human Review 1 and +3.7 (−0.3 to 7.4) for Human Review 2. eTable 4 retains source-specific domain summaries, eligibility accounting and complete paired question contrasts for both codings, including sparse and unfavorable results.</w:t>
       </w:r>
     </w:p>
     <w:p>
@@ -125,7 +125,7 @@
               <a:graphicData uri="http://schemas.openxmlformats.org/drawingml/2006/picture">
                 <pic:pic>
                   <pic:nvPicPr>
-                    <pic:cNvPr descr="C:\Users\ALI-SA~1\AppData\Local\Temp\arbiter-analysis-word-sv9nzcjq\Figure1.png" id="14" name="Picture"/>
+                    <pic:cNvPr descr="C:\Users\ALI-SA~1\AppData\Local\Temp\arbiter-analysis-word-zqdb1zj1\Figure1.png" id="14" name="Picture"/>
                     <pic:cNvPicPr>
                       <a:picLocks noChangeArrowheads="1" noChangeAspect="1"/>
                     </pic:cNvPicPr>
@@ -194,7 +194,7 @@
               <a:graphicData uri="http://schemas.openxmlformats.org/drawingml/2006/picture">
                 <pic:pic>
                   <pic:nvPicPr>
-                    <pic:cNvPr descr="C:\Users\ALI-SA~1\AppData\Local\Temp\arbiter-analysis-word-sv9nzcjq\Figure2.png" id="18" name="Picture"/>
+                    <pic:cNvPr descr="C:\Users\ALI-SA~1\AppData\Local\Temp\arbiter-analysis-word-zqdb1zj1\Figure2.png" id="18" name="Picture"/>
                     <pic:cNvPicPr>
                       <a:picLocks noChangeArrowheads="1" noChangeAspect="1"/>
                     </pic:cNvPicPr>
@@ -293,7 +293,7 @@
               <a:graphicData uri="http://schemas.openxmlformats.org/drawingml/2006/picture">
                 <pic:pic>
                   <pic:nvPicPr>
-                    <pic:cNvPr descr="C:\Users\ALI-SA~1\AppData\Local\Temp\arbiter-analysis-word-sv9nzcjq\Figure3.png" id="24" name="Picture"/>
+                    <pic:cNvPr descr="C:\Users\ALI-SA~1\AppData\Local\Temp\arbiter-analysis-word-zqdb1zj1\Figure3.png" id="24" name="Picture"/>
                     <pic:cNvPicPr>
                       <a:picLocks noChangeArrowheads="1" noChangeAspect="1"/>
                     </pic:cNvPicPr>
@@ -362,7 +362,7 @@
               <a:graphicData uri="http://schemas.openxmlformats.org/drawingml/2006/picture">
                 <pic:pic>
                   <pic:nvPicPr>
-                    <pic:cNvPr descr="C:\Users\ALI-SA~1\AppData\Local\Temp\arbiter-analysis-word-sv9nzcjq\Figure4.png" id="28" name="Picture"/>
+                    <pic:cNvPr descr="C:\Users\ALI-SA~1\AppData\Local\Temp\arbiter-analysis-word-zqdb1zj1\Figure4.png" id="28" name="Picture"/>
                     <pic:cNvPicPr>
                       <a:picLocks noChangeArrowheads="1" noChangeAspect="1"/>
                     </pic:cNvPicPr>
@@ -431,7 +431,7 @@
               <a:graphicData uri="http://schemas.openxmlformats.org/drawingml/2006/picture">
                 <pic:pic>
                   <pic:nvPicPr>
-                    <pic:cNvPr descr="C:\Users\ALI-SA~1\AppData\Local\Temp\arbiter-analysis-word-sv9nzcjq\Figure5.png" id="32" name="Picture"/>
+                    <pic:cNvPr descr="C:\Users\ALI-SA~1\AppData\Local\Temp\arbiter-analysis-word-zqdb1zj1\Figure5.png" id="32" name="Picture"/>
                     <pic:cNvPicPr>
                       <a:picLocks noChangeArrowheads="1" noChangeAspect="1"/>
                     </pic:cNvPicPr>
@@ -470,7 +470,7 @@
         <w:keepLines/>
       </w:pPr>
       <w:r>
-        <w:t xml:space="preserve">Figure 5. Paired signalling-answer diagnostics. Rows cover all five domains against each human reviewer; n is the number of question components evaluable in both arms. Diamonds and bars show ARBITER minus Unassisted exact agreement and 95% intervals. Five-level matching distinguishes yes, probably yes, no, probably no and no information. Collapsed matching combines yes/probably yes and no/probably no, leaving no information separate. These are different estimands. D1: randomisation process; D2: deviations from intended interventions; D3: missing outcome data; D4: outcome measurement; D5: selection of the reported result. D3 and D5 illustrate reference dependence and the effect of coding. eTable 6 contains source-specific domain summaries, complete paired question contrasts and eligibility accounting for both codings. CI, 95% confidence interval; 10,000 percentile bootstrap replicates, trials resampled within meta-analysis; seed 20261018.</w:t>
+        <w:t xml:space="preserve">Figure 5. Paired signalling-answer diagnostics. Rows cover all five domains against each human reviewer; n is the number of question components evaluable in both arms. Diamonds and bars show ARBITER minus Unassisted exact agreement and 95% intervals. Five-level matching distinguishes yes, probably yes, no, probably no and no information. Collapsed matching combines yes/probably yes and no/probably no, leaving no information separate. These are different estimands. D1: randomisation process; D2: deviations from intended interventions; D3: missing outcome data; D4: outcome measurement; D5: selection of the reported result. D3 and D5 illustrate reference dependence and the effect of coding. eTable 4 contains source-specific domain summaries, complete paired question contrasts and eligibility accounting for both codings. CI, 95% confidence interval; 10,000 percentile bootstrap replicates, trials resampled within meta-analysis; seed 20261018.</w:t>
       </w:r>
     </w:p>
     <w:bookmarkEnd w:id="33"/>

</xml_diff>